<commit_message>
Review RNA-seq statistics and expand visualization and discovery workflows
</commit_message>
<xml_diff>
--- a/docs/USER_GUIDE.docx
+++ b/docs/USER_GUIDE.docx
@@ -28,11 +28,11 @@
     </w:p>
     <w:p>
       <w:r>
-        <w:t>说明书版本：2026.10.26-r2</w:t>
+        <w:t>说明书版本：2026.10.27-r3</w:t>
         <w:br/>
         <w:t>适用程序：v2.0</w:t>
         <w:br/>
-        <w:t>更新日期：2026-10-26</w:t>
+        <w:t>更新日期：2026-10-27</w:t>
       </w:r>
     </w:p>
     <w:p>
@@ -45,7 +45,7 @@
         <w:pStyle w:val="Caption"/>
       </w:pPr>
       <w:r>
-        <w:t>程序内容指纹：sha256:2f73b1511f19590027d63dfa5d20fcd8f6cccc765b9e183322ef8dea12525a0b</w:t>
+        <w:t>程序内容指纹：sha256:5bcab7cd45d65b69d1edee1b34923e3fc75edc237ff61a370f89a35d237fcdc8</w:t>
       </w:r>
     </w:p>
     <w:p>
@@ -622,6 +622,21 @@
       </w:hyperlink>
     </w:p>
     <w:p>
+      <w:pPr>
+        <w:spacing w:after="40"/>
+        <w:ind w:left="0"/>
+      </w:pPr>
+      <w:hyperlink w:anchor="section-8a675dfc6b48">
+        <w:r>
+          <w:rPr>
+            <w:color w:val="126657"/>
+            <w:u w:val="single"/>
+          </w:rPr>
+          <w:t>27. 本轮流程审查与高级探索的操作路线</w:t>
+        </w:r>
+      </w:hyperlink>
+    </w:p>
+    <w:p>
       <w:r>
         <w:br w:type="page"/>
       </w:r>
@@ -629,13 +644,13 @@
     <w:p>
       <w:r>
         <w:rPr/>
-        <w:t>说明书版本：2026.10.26-r2</w:t>
-      </w:r>
-    </w:p>
-    <w:p>
-      <w:r>
-        <w:rPr/>
-        <w:t>适用程序：小鼠 bulk RNA-seq 工作站 2.0，Windows + WSL2 Ubuntu 24.04 或原生 Ubuntu。本文对应当前仓库实际实现；每个任务的真实设计、软件版本与完成状态，以该任务保存的参数、R-session、日志和报告为准。说明书编写日期：2026-10-26。</w:t>
+        <w:t>说明书版本：2026.10.27-r3</w:t>
+      </w:r>
+    </w:p>
+    <w:p>
+      <w:r>
+        <w:rPr/>
+        <w:t>适用程序：小鼠 bulk RNA-seq 工作站 2.0，Windows + WSL2 Ubuntu 24.04 或原生 Ubuntu。本文对应当前仓库实际实现；每个任务的真实设计、软件版本与完成状态，以该任务保存的参数、R-session、日志和报告为准。说明书编写日期：2026-10-27。</w:t>
       </w:r>
     </w:p>
     <w:p>
@@ -7010,7 +7025,7 @@
       </w:r>
       <w:r>
         <w:rPr/>
-        <w:t xml:space="preserve"> 是独立动物标识，不代表应把每个唯一 subject 都加入这个非配对示例的模型；把每个样本独有的标识当作协变量会消耗全部自由度。样本表可以保存描述性列，只有被选中的协变量才进入 DESeq2 模型。</w:t>
+        <w:t xml:space="preserve"> 是独立动物标识，不代表应把每个唯一 subject 都加入这个非配对示例的模型；把每个样本独有的标识当作协变量会消耗全部自由度。样本表可以保存描述性列，只有被选中的协变量才进入 DESeq2 模型。编号按字符串保留前导零，例如001不会变成1；subject是动物标识，不可作为连续表型选入挖掘。</w:t>
       </w:r>
     </w:p>
     <w:p>
@@ -7051,7 +7066,7 @@
       </w:r>
       <w:r>
         <w:rPr/>
-        <w:t>。同一任务不能混合单端和双端。准备匹配版本的小鼠转录本 FASTA 及 tx2gene。FASTA 应为转录本序列，例如同版本 Ensembl cDNA 加 ncRNA；不能把完整基因组 FASTA 填到转录本输入框。</w:t>
+        <w:t>。同一任务不能混合单端和双端，不接受同一个FASTQ重复充当不同样本。准备匹配版本的小鼠转录本 FASTA 及 tx2gene。FASTA 应为转录本序列，例如同版本 Ensembl cDNA 加 ncRNA；不能把完整基因组 FASTA 填到转录本输入框。</w:t>
       </w:r>
     </w:p>
     <w:p>
@@ -7099,7 +7114,19 @@
     <w:p>
       <w:r>
         <w:rPr/>
-        <w:t>转录本去掉版本后必须唯一；转录本对应多个不同基因时不能直接用于汇总。tximport 忽略转录本版本后缀，基因注释映射也去除基因版本后缀，但这不解决不同参考 release 的实质差异。</w:t>
+        <w:t xml:space="preserve">转录本去掉管道符描述和版本后必须唯一；转录本对应多个不同基因时不能直接用于汇总。tximport与映射表都统一忽略转录本管道符 </w:t>
+      </w:r>
+      <w:r>
+        <w:rPr>
+          <w:rFonts w:ascii="Consolas" w:hAnsi="Consolas"/>
+          <w:sz w:val="18"/>
+          <w:shd w:fill="EDF4EF"/>
+        </w:rPr>
+        <w:t>|</w:t>
+      </w:r>
+      <w:r>
+        <w:rPr/>
+        <w:t xml:space="preserve"> 后的描述及版本后缀（兼容常见GENCODE/Ensembl头），基因注释映射也去除基因版本后缀，但这不解决不同参考 release 的实质差异。</w:t>
       </w:r>
     </w:p>
     <w:p>
@@ -7207,6 +7234,12 @@
       <w:r>
         <w:rPr/>
         <w:t>，工作站可复制相应元数据。只有 quant.sf 时仍可汇总表达，但缺失的映射率或方向诊断不会被补造，也不会重新产生 fastp 原始质量报告。</w:t>
+      </w:r>
+    </w:p>
+    <w:p>
+      <w:r>
+        <w:rPr/>
+        <w:t>Salmon导入要求各文件具有一致的转录本列表和顺序，Length/EffectiveLength为正，TPM/NumReads有限且非负，并与tx2gene规范化ID匹配；同一个quant.sf不能重复充当多个样本。</w:t>
       </w:r>
     </w:p>
     <w:p>
@@ -7691,7 +7724,31 @@
     <w:p>
       <w:r>
         <w:rPr/>
-        <w:t>Salmon 将 reads/fragment 与转录本参考进行匹配并估计转录本丰度，工作站启用 selective alignment、序列偏好校正和 GC 偏好校正。每个任务建立转录本索引，随后逐样本量化。当前索引未集成完整基因组 decoy；与使用 decoy-aware 索引或基因组比对的其他流程比较时应记录这一差别。[1–3]</w:t>
+        <w:t xml:space="preserve">Salmon 将 reads/fragment 与转录本参考进行匹配并估计转录本丰度，工作站启用 selective alignment、序列偏好校正和 GC 偏好校正。每个任务建立转录本索引，随后逐样本量化。可在 FASTQ 设置中提供与转录本同物种、同组装/release 的基因组 FASTA（可为 .gz）；程序流式生成 </w:t>
+      </w:r>
+      <w:r>
+        <w:rPr>
+          <w:rFonts w:ascii="Consolas" w:hAnsi="Consolas"/>
+          <w:sz w:val="18"/>
+          <w:shd w:fill="EDF4EF"/>
+        </w:rPr>
+        <w:t>reference/gentrome.fa</w:t>
+      </w:r>
+      <w:r>
+        <w:rPr/>
+        <w:t xml:space="preserve"> 与 </w:t>
+      </w:r>
+      <w:r>
+        <w:rPr>
+          <w:rFonts w:ascii="Consolas" w:hAnsi="Consolas"/>
+          <w:sz w:val="18"/>
+          <w:shd w:fill="EDF4EF"/>
+        </w:rPr>
+        <w:t>decoys.txt</w:t>
+      </w:r>
+      <w:r>
+        <w:rPr/>
+        <w:t>，建立 full-decoy 索引，以减少相似基因组序列导致的错误转录本分配。输入ID必须唯一，基因组与转录本ID不能冲突。没有提供时使用原转录本索引并提示限制。小鼠完整基因组会增加索引内存和磁盘占用，32GB机器需保留资源；本地小型合成参考验证不等于已验证你的完整小鼠参考能在该内存上完成。[1–3]</w:t>
       </w:r>
     </w:p>
     <w:p>
@@ -7709,7 +7766,31 @@
       </w:r>
       <w:r>
         <w:rPr/>
-        <w:t xml:space="preserve"> 自动判断；双端支持 IU/ISR/ISF，单端支持 U/SR/SF。链特异性应根据建库试剂说明和 Salmon 实际方向记录共同确认，不能只凭是否双端判断。查看映射率、兼容方向比例、处理 fragments、估计数量与样本间差异。</w:t>
+        <w:t xml:space="preserve"> 自动判断；双端支持 IU/ISR/ISF，单端支持 U/SR/SF。单端无法直接从配对距离估计片段长度，界面另提供 </w:t>
+      </w:r>
+      <w:r>
+        <w:rPr>
+          <w:rFonts w:ascii="Consolas" w:hAnsi="Consolas"/>
+          <w:sz w:val="18"/>
+          <w:shd w:fill="EDF4EF"/>
+        </w:rPr>
+        <w:t>fragment_mean</w:t>
+      </w:r>
+      <w:r>
+        <w:rPr/>
+        <w:t xml:space="preserve"> 和 </w:t>
+      </w:r>
+      <w:r>
+        <w:rPr>
+          <w:rFonts w:ascii="Consolas" w:hAnsi="Consolas"/>
+          <w:sz w:val="18"/>
+          <w:shd w:fill="EDF4EF"/>
+        </w:rPr>
+        <w:t>fragment_sd</w:t>
+      </w:r>
+      <w:r>
+        <w:rPr/>
+        <w:t>，传给Salmon的fldMean/fldSD；默认200/80只是默认分布假设，应按建库片段信息设置，不能把read长度直接当片段长度。双端从配对数据估计，不使用这两个值。链特异性应根据建库试剂说明和 Salmon 实际方向记录共同确认，不能只凭是否双端判断。查看映射率、兼容方向比例、处理 fragments、估计数量与样本间差异。</w:t>
       </w:r>
     </w:p>
     <w:p>
@@ -9996,7 +10077,7 @@
     <w:p>
       <w:r>
         <w:rPr/>
-        <w:t>本工作站使用本次低表达过滤后、具有有限 Wald stat、ID 可用且能映射到对应集合的基因作为候选背景，再与各数据库集合的成员取交集。它不是“整个小鼠基因组”背景。一个 ID 对应多个表达行时优先保留平均表达较高的一行，不按最显著 P 值挑行。不同输入、映射和参考版本会改变背景及统计结果。</w:t>
+        <w:t>本工作站使用本次低表达过滤后、具有有限 Wald stat、ID 可用且能映射到对应集合的基因作为候选背景，再与各数据库集合的成员取交集。GO 的 BP、CC、MF 分别与各自成员取交集，具有各自的 N 与 n；例如只有 BP 注释的基因不应扩大 CC 背景。它不是“整个小鼠基因组”背景。先排除非有限 Wald stat；同一个 ID 的多个有效表达行优先保留平均表达较高的一行，不按最显著 P 值挑行。不同输入、映射和参考版本会改变背景及统计结果。</w:t>
       </w:r>
     </w:p>
     <w:p>
@@ -10990,7 +11071,7 @@
     <w:p>
       <w:r>
         <w:rPr/>
-        <w:t>默认选取 VST 变异最高的 3000 个基因，可调 100–6000；使用 signed 网络和 signed TOM，模块最小大小 30、每块最多 3000 基因、模块合并阈值 0.25、随机种子 42。先输出软阈值诊断，再使用所填 power 建网络，默认 power=6 仅是初始参数，程序不会自动以最佳拟合替换它。</w:t>
+        <w:t>默认选取 VST 变异最高的 3000 个基因，可调 100–6000；使用 signed 网络和 signed TOM，模块最小大小 30、每块最多 3000 基因、模块合并阈值 0.25、随机种子 42。先输出软阈值诊断。新建任务的界面默认自动选择：在 1–10、12、14、16、18、20 中选首个 signed R²≥0.85 且 slope&lt;0 的 power；没有符合项时保留诊断并明确跳过网络。也可选择手动模式（初始值6），结合诊断自行指定。R²阈值是可复核的启发式，不是网络正确性的认证；原有任务的手动参数不会被后台改写。</w:t>
       </w:r>
     </w:p>
     <w:p>
@@ -11215,7 +11296,25 @@
     <w:p>
       <w:r>
         <w:rPr/>
-        <w:t>当前网络边表取绝对 kME 较高的最多 120 个基因，保留 signed 邻接权重大于 0.2 的边，并按权重最多输出 500 条。这个可视化子集不是“所有模块的完整调控网络”。灰色模块通常代表未明确分配的基因，不应像稳定模块那样直接作强解释。</w:t>
+        <w:t xml:space="preserve">模块还可做GO/GMT功能富集：背景限定为本次进入网络的全部基因（含grey，再按注释覆盖限定），每个非grey模块作为选集；按数据库和ontology，对全部“模块×可测试术语”统一BH，不按每个模块单独降低校正范围。输出 </w:t>
+      </w:r>
+      <w:r>
+        <w:rPr>
+          <w:rFonts w:ascii="Consolas" w:hAnsi="Consolas"/>
+          <w:sz w:val="18"/>
+          <w:shd w:fill="EDF4EF"/>
+        </w:rPr>
+        <w:t>wgcna-module-enrichment.csv</w:t>
+      </w:r>
+      <w:r>
+        <w:rPr/>
+        <w:t>，可在网络页选择模块功能富集图并指定module。</w:t>
+      </w:r>
+    </w:p>
+    <w:p>
+      <w:r>
+        <w:rPr/>
+        <w:t>当前网络边表取绝对 kME 较高的最多 120 个基因，保留 signed 邻接权重大于 0.2 的边，并按权重最多输出 500 条。这个可视化子集不是“所有模块的完整调控网络”。grey 代表未分配基因；当前不计入生物模块数，不作为 hub 或模块–表型关联解释。若全为grey，会保留诊断并说明没有检测到可用模块。</w:t>
       </w:r>
     </w:p>
     <w:p>
@@ -11290,7 +11389,7 @@
     <w:p>
       <w:r>
         <w:rPr/>
-        <w:t>基因与样本表数值列的关联使用探索性 Spearman。它未调整协变量，也未对“全基因 × 全表型”的搜索作整体校正，P 值不能直接用于高维因果结论。正式证据需要独立样本、预先定义的验证问题，以及合适的 qPCR、蛋白、功能干预等实验。</w:t>
+        <w:t>基因查询卡片与样本表数值列的关联仍提供探索性 Spearman。它未调整协变量，也未对“全基因 × 全表型”的搜索作整体校正，P 值不能直接用于高维因果结论。正式证据需要独立样本、预先定义的验证问题，以及合适的 qPCR、蛋白、功能干预等实验。</w:t>
       </w:r>
     </w:p>
     <w:p>
@@ -11430,7 +11529,7 @@
     <w:p>
       <w:r>
         <w:rPr/>
-        <w:t>热图聚类可切换，当前层次聚类使用 average linkage；样本相关和距离图需结合其实际矩阵含义解读。GO/KEGG 点图的大小可代表命中数量，颜色对应校正 P 值，横轴显示 gene ratio；GSEA 条形图显示 NES。通路活性和 TF 活性热图显示的是各自分数，不要把它们的色标当作 log2FC。</w:t>
+        <w:t>热图聚类可切换，当前层次聚类使用 average linkage；样本相关和距离图需结合其实际矩阵含义解读。GO/KEGG 点图的大小可代表命中数量，颜色对应校正 P 值，横轴显示 gene ratio；GSEA 条形图显示 NES。通路活性和 TF 活性热图可选择逐行Z-score或各自原分数，色标不是 log2FC；不宜把不同通路的分数直接当成统一绝对强度比较。样本相关图可选 Pearson/Spearman，以1-r与average linkage排序；样本距离图直接使用VST欧氏距离和average linkage。</w:t>
       </w:r>
     </w:p>
     <w:p>
@@ -11447,7 +11546,7 @@
     <w:p>
       <w:r>
         <w:rPr/>
-        <w:t>通用编辑包含标题、坐标名称、宽高、字号、配色、显示数量等；火山图等还提供点大小/透明度、标签、范围和显示阈值。默认图宽 9、高 6 英寸、字号 11、300 dpi；界面允许的范围由程序校验。选择颜色时兼顾组别含义和色觉可辨性，整个报告保持同一组同一颜色。</w:t>
+        <w:t>通用编辑包含标题、坐标名称、宽高、字号、配色、显示数量等；火山图等还提供点大小/透明度、标签、范围和显示阈值。火山图、PCA和网络图默认宽7、高6.5英寸，其余默认宽9、高6.5英寸；基础字号11、300 dpi；界面允许的范围由程序校验。选择颜色时兼顾组别含义和色觉可辨性，整个报告保持同一组同一颜色。</w:t>
       </w:r>
     </w:p>
     <w:p>
@@ -19788,7 +19887,852 @@
     <w:p>
       <w:r>
         <w:rPr/>
-        <w:t>本版更新记录：2026.10.26-r2增加九个从零入门单元、四幅原理示意图、逐步计算案例、核心方法的直觉解释、按主题术语表与12题自测；保留实际工作站操作和方法边界。</w:t>
+        <w:t>上一版2026.10.26-r2增加九个从零入门单元、四幅原理示意图、逐步计算案例、核心方法的直觉解释、按主题术语表与12题自测；保留实际工作站操作和方法边界。</w:t>
+      </w:r>
+    </w:p>
+    <w:p>
+      <w:pPr>
+        <w:pStyle w:val="Heading1"/>
+      </w:pPr>
+      <w:bookmarkStart w:id="111" w:name="section-8a675dfc6b48"/>
+      <w:r>
+        <w:rPr/>
+        <w:t>27. 本轮流程审查与高级探索的操作路线</w:t>
+      </w:r>
+      <w:bookmarkEnd w:id="111"/>
+    </w:p>
+    <w:p>
+      <w:r>
+        <w:rPr/>
+        <w:t xml:space="preserve">本章对应2026.10.27-r3。逐段核对官方方法和本项目代码，并以本地合成数据验证。它不是对你的真实测序样本出具的质检合格证明。审查原始记录见仓库 </w:t>
+      </w:r>
+      <w:r>
+        <w:rPr>
+          <w:rFonts w:ascii="Consolas" w:hAnsi="Consolas"/>
+          <w:sz w:val="18"/>
+          <w:shd w:fill="EDF4EF"/>
+        </w:rPr>
+        <w:t>docs/ANALYSIS_REVIEW.md</w:t>
+      </w:r>
+      <w:r>
+        <w:rPr/>
+        <w:t>。</w:t>
+      </w:r>
+    </w:p>
+    <w:p>
+      <w:pPr>
+        <w:pStyle w:val="Heading2"/>
+      </w:pPr>
+      <w:bookmarkStart w:id="112" w:name="section-3bb5f8eaa45b"/>
+      <w:r>
+        <w:rPr/>
+        <w:t>27.1 先理解本次哪些结果会改变</w:t>
+      </w:r>
+      <w:bookmarkEnd w:id="112"/>
+    </w:p>
+    <w:p>
+      <w:r>
+        <w:rPr/>
+        <w:t>本次修正GO背景：BP、CC、MF分别限定本ontology可映射的表达基因；修正ID折叠先排除无效Wald再选平均表达代表行。新运行的富集结果可能与旧任务不同。没有后台覆盖旧统计；需要采用修正方法时新建任务，保留旧任务用于比较。两种固定DEG方案完全保留，切换只选择预先计算的DEG/ORA，不改变GSEA排序、ssGSEA或WGCNA的输入。</w:t>
+      </w:r>
+    </w:p>
+    <w:p>
+      <w:r>
+        <w:rPr/>
+        <w:t>DESeq2的普通Wald P检验针对LFC=0。padj&lt;0.05再筛|LFC|&gt;1，是“统计证据 + 效应阈值”的组合筛选，并不是已经检验并控制“真实|LFC|&gt;1”的错误率；后者需要另行配置lfcThreshold等正式阈值检验，目前未作为内置第三方案。不要把这两种问题混为一谈。</w:t>
+      </w:r>
+    </w:p>
+    <w:p>
+      <w:pPr>
+        <w:pStyle w:val="Heading2"/>
+      </w:pPr>
+      <w:bookmarkStart w:id="113" w:name="section-eba4503722f4"/>
+      <w:r>
+        <w:rPr/>
+        <w:t>27.2 用完整设计调整基因–表型关联</w:t>
+      </w:r>
+      <w:bookmarkEnd w:id="113"/>
+    </w:p>
+    <w:p>
+      <w:r>
+        <w:rPr/>
+        <w:t xml:space="preserve">新任务可在“用于表型关联的样本列名”填写连续指标，如 </w:t>
+      </w:r>
+      <w:r>
+        <w:rPr>
+          <w:rFonts w:ascii="Consolas" w:hAnsi="Consolas"/>
+          <w:sz w:val="18"/>
+          <w:shd w:fill="EDF4EF"/>
+        </w:rPr>
+        <w:t>disease_score,weight</w:t>
+      </w:r>
+      <w:r>
+        <w:rPr/>
+        <w:t xml:space="preserve">。至少8个独立样本，并且加入分组、全部协变量和该表型后残差自由度至少3，才计算新表 </w:t>
+      </w:r>
+      <w:r>
+        <w:rPr>
+          <w:rFonts w:ascii="Consolas" w:hAnsi="Consolas"/>
+          <w:sz w:val="18"/>
+          <w:shd w:fill="EDF4EF"/>
+        </w:rPr>
+        <w:t>gene-trait-adjusted.csv</w:t>
+      </w:r>
+      <w:r>
+        <w:rPr/>
+        <w:t>。表型至少有三个不同数值；重复subject、缺失、数值不足或被原设计完全解释的表型会跳过并说明原因。原始卡片中的Spearman仍然只是未调整探索。</w:t>
+      </w:r>
+    </w:p>
+    <w:p>
+      <w:r>
+        <w:rPr/>
+        <w:t>有重复subject时，通路的普通独立样本表型相关检验会跳过；基因卡片的Spearman只展示描述系数，不给独立样本P。无重复时卡片P仍是渐近近似，小样本不应据此直接作强结论。</w:t>
+      </w:r>
+    </w:p>
+    <w:p>
+      <w:r>
+        <w:rPr/>
+        <w:t xml:space="preserve">新检验将每个基因的VST和表型都对完整DESeq2模型矩阵X（包含group）做线性残差化，然后计算残差之间的Pearson相关。若X的秩为r，自由度为 </w:t>
+      </w:r>
+      <w:r>
+        <w:rPr>
+          <w:rFonts w:ascii="Consolas" w:hAnsi="Consolas"/>
+          <w:sz w:val="18"/>
+          <w:shd w:fill="EDF4EF"/>
+        </w:rPr>
+        <w:t>n-r-1</w:t>
+      </w:r>
+      <w:r>
+        <w:rPr/>
+        <w:t>；对所有有限的“保留基因×本次可检验表型”P值统一BH。结果列包含gene、trait、correlation、pvalue、padj、n和df。</w:t>
+      </w:r>
+    </w:p>
+    <w:p>
+      <w:r>
+        <w:rPr/>
+        <w:t>例如治疗组分数普遍高、某基因也在治疗组高，原始散点可能高度相关；控制group后若组内不存在共同变化，偏相关会接近零。反之，控制group后仍有关联，说明在这个线性模型假定下有额外的共同变化。它仍可能受未测量混杂、异常值或样本选择影响，不证明因果。检查散点、线性关系、残差与研究设计；8是软件最低门槛，不是有足够统计效能的保证。</w:t>
+      </w:r>
+    </w:p>
+    <w:p>
+      <w:r>
+        <w:rPr/>
+        <w:t>在“通路活性与关键基因”的图表列表选择“基因–表型散点图”，填写gene和trait。点显示原始样本表达与表型，颜色区分组别，图中单独注明调整后VST偏相关及全局q；原始点图与调整后统计不应被误读为同一个相关系数。</w:t>
+      </w:r>
+    </w:p>
+    <w:p>
+      <w:pPr>
+        <w:pStyle w:val="Heading2"/>
+      </w:pPr>
+      <w:bookmarkStart w:id="114" w:name="section-2528900097d2"/>
+      <w:r>
+        <w:rPr/>
+        <w:t>27.3 从通路向候选基因逐层核对</w:t>
+      </w:r>
+      <w:bookmarkEnd w:id="114"/>
+    </w:p>
+    <w:p>
+      <w:pPr>
+        <w:pStyle w:val="ListParagraph"/>
+        <w:ind w:left="283" w:hanging="198"/>
+      </w:pPr>
+      <w:r>
+        <w:t xml:space="preserve">1. </w:t>
+      </w:r>
+      <w:r>
+        <w:rPr/>
+        <w:t>在GO/KEGG/GSEA先核对数据库、比较方向、背景与校正范围。</w:t>
+      </w:r>
+    </w:p>
+    <w:p>
+      <w:pPr>
+        <w:pStyle w:val="ListParagraph"/>
+        <w:ind w:left="283" w:hanging="198"/>
+      </w:pPr>
+      <w:r>
+        <w:t xml:space="preserve">2. </w:t>
+      </w:r>
+      <w:r>
+        <w:rPr/>
+        <w:t>点击GSEA项查看三层曲线：运行ES、基因集命中条带、完整Wald排序。</w:t>
+      </w:r>
+    </w:p>
+    <w:p>
+      <w:pPr>
+        <w:pStyle w:val="ListParagraph"/>
+        <w:ind w:left="283" w:hanging="198"/>
+      </w:pPr>
+      <w:r>
+        <w:t xml:space="preserve">3. </w:t>
+      </w:r>
+      <w:r>
+        <w:rPr/>
+        <w:t>选择“GSEA核心基因表达热图”，填写同一数据库与term，观察leading-edge在各重复中的模式。可逐行Z-score或保留VST；默认最多20行，可调3–100。</w:t>
+      </w:r>
+    </w:p>
+    <w:p>
+      <w:pPr>
+        <w:pStyle w:val="ListParagraph"/>
+        <w:ind w:left="283" w:hanging="198"/>
+      </w:pPr>
+      <w:r>
+        <w:t xml:space="preserve">4. </w:t>
+      </w:r>
+      <w:r>
+        <w:rPr/>
+        <w:t>选择“通路基因重叠网络”，默认以显著GSEA leading-edge的Jaccard建边，也可使用所有已检验的集合成员。</w:t>
+      </w:r>
+      <w:r>
+        <w:rPr>
+          <w:rFonts w:ascii="Consolas" w:hAnsi="Consolas"/>
+          <w:sz w:val="18"/>
+          <w:shd w:fill="EDF4EF"/>
+        </w:rPr>
+        <w:t>Jaccard=交集成员数/并集成员数</w:t>
+      </w:r>
+      <w:r>
+        <w:rPr/>
+        <w:t>，调高边阈值可减少杂乱；没有边可能确实没有足够重叠。此图不是通路调控图，更不是蛋白互作图。</w:t>
+      </w:r>
+    </w:p>
+    <w:p>
+      <w:pPr>
+        <w:pStyle w:val="ListParagraph"/>
+        <w:ind w:left="283" w:hanging="198"/>
+      </w:pPr>
+      <w:r>
+        <w:t xml:space="preserve">5. </w:t>
+      </w:r>
+      <w:r>
+        <w:rPr/>
+        <w:t>查看“候选基因证据整合”表：同一行保留DESeq2、当前significant、leading_edge_sets/count，以及可用时的module/kME和最佳连续表型关联。leading-edge计数来自padj&lt;0.05的GO/GMT结果，相近集合共享基因，次数多不代表多次独立证实。</w:t>
+      </w:r>
+    </w:p>
+    <w:p>
+      <w:pPr>
+        <w:pStyle w:val="ListParagraph"/>
+        <w:ind w:left="283" w:hanging="198"/>
+      </w:pPr>
+      <w:r>
+        <w:t xml:space="preserve">6. </w:t>
+      </w:r>
+      <w:r>
+        <w:rPr/>
+        <w:t>点击gene检查样本级表达；可用标准化计数、VST或已保存TPM，选择箱线/小提琴、逐样本点、subject配对连线。再据实验问题安排独立验证。</w:t>
+      </w:r>
+    </w:p>
+    <w:p>
+      <w:r>
+        <w:rPr/>
+        <w:t>证据表不生成任意加权的“关键基因概率”，也不会因为缺少WGCNA或表型而伪造数值。最佳表型列是探索性摘要，其全局BH已覆盖所有可检验表型；它不是独立队列结果。切换DEG方案会同步当前证据表的DEG标志，leading-edge和偏相关保持其原输入与模型。</w:t>
+      </w:r>
+    </w:p>
+    <w:p>
+      <w:pPr>
+        <w:pStyle w:val="Heading2"/>
+      </w:pPr>
+      <w:bookmarkStart w:id="115" w:name="section-8685bb999a77"/>
+      <w:r>
+        <w:rPr/>
+        <w:t>27.4 各类图表的新调节与用途</w:t>
+      </w:r>
+      <w:bookmarkEnd w:id="115"/>
+    </w:p>
+    <w:tbl>
+      <w:tblPr>
+        <w:tblStyle w:val="TableGrid"/>
+        <w:tblW w:type="auto" w:w="0"/>
+        <w:tblLook w:firstColumn="1" w:firstRow="1" w:lastColumn="0" w:lastRow="0" w:noHBand="0" w:noVBand="1" w:val="04A0"/>
+      </w:tblPr>
+      <w:tblGrid>
+        <w:gridCol w:w="3175"/>
+        <w:gridCol w:w="3175"/>
+        <w:gridCol w:w="3175"/>
+      </w:tblGrid>
+      <w:tr>
+        <w:trPr>
+          <w:tblHeader/>
+          <w:cantSplit/>
+        </w:trPr>
+        <w:tc>
+          <w:tcPr>
+            <w:tcW w:type="dxa" w:w="3175"/>
+            <w:shd w:fill="DCECE5"/>
+          </w:tcPr>
+          <w:p>
+            <w:r>
+              <w:rPr>
+                <w:b/>
+                <w:sz w:val="18"/>
+              </w:rPr>
+              <w:t>图表</w:t>
+            </w:r>
+          </w:p>
+        </w:tc>
+        <w:tc>
+          <w:tcPr>
+            <w:tcW w:type="dxa" w:w="3175"/>
+            <w:shd w:fill="DCECE5"/>
+          </w:tcPr>
+          <w:p>
+            <w:r>
+              <w:rPr>
+                <w:b/>
+                <w:sz w:val="18"/>
+              </w:rPr>
+              <w:t>可操作的调节</w:t>
+            </w:r>
+          </w:p>
+        </w:tc>
+        <w:tc>
+          <w:tcPr>
+            <w:tcW w:type="dxa" w:w="3175"/>
+            <w:shd w:fill="DCECE5"/>
+          </w:tcPr>
+          <w:p>
+            <w:r>
+              <w:rPr>
+                <w:b/>
+                <w:sz w:val="18"/>
+              </w:rPr>
+              <w:t>必须核对的解释</w:t>
+            </w:r>
+          </w:p>
+        </w:tc>
+      </w:tr>
+      <w:tr>
+        <w:trPr>
+          <w:cantSplit/>
+        </w:trPr>
+        <w:tc>
+          <w:tcPr>
+            <w:tcW w:type="dxa" w:w="3175"/>
+            <w:shd w:fill="FFFFFF"/>
+          </w:tcPr>
+          <w:p>
+            <w:r>
+              <w:rPr>
+                <w:sz w:val="18"/>
+              </w:rPr>
+              <w:t>所有图</w:t>
+            </w:r>
+          </w:p>
+        </w:tc>
+        <w:tc>
+          <w:tcPr>
+            <w:tcW w:type="dxa" w:w="3175"/>
+            <w:shd w:fill="FFFFFF"/>
+          </w:tcPr>
+          <w:p>
+            <w:r>
+              <w:rPr>
+                <w:sz w:val="18"/>
+              </w:rPr>
+              <w:t>画布方形/横向/纵向预设、宽高、字号、标题、坐标、图例、网格；预览再保存</w:t>
+            </w:r>
+          </w:p>
+        </w:tc>
+        <w:tc>
+          <w:tcPr>
+            <w:tcW w:type="dxa" w:w="3175"/>
+            <w:shd w:fill="FFFFFF"/>
+          </w:tcPr>
+          <w:p>
+            <w:r>
+              <w:rPr>
+                <w:sz w:val="18"/>
+              </w:rPr>
+              <w:t>网页按物理画布比例居中，导出使用相同设置；两种引擎不保证像素完全一样</w:t>
+            </w:r>
+          </w:p>
+        </w:tc>
+      </w:tr>
+      <w:tr>
+        <w:trPr>
+          <w:cantSplit/>
+        </w:trPr>
+        <w:tc>
+          <w:tcPr>
+            <w:tcW w:type="dxa" w:w="3175"/>
+            <w:shd w:fill="F4F7F5"/>
+          </w:tcPr>
+          <w:p>
+            <w:r>
+              <w:rPr>
+                <w:sz w:val="18"/>
+              </w:rPr>
+              <w:t>火山/MA</w:t>
+            </w:r>
+          </w:p>
+        </w:tc>
+        <w:tc>
+          <w:tcPr>
+            <w:tcW w:type="dxa" w:w="3175"/>
+            <w:shd w:fill="F4F7F5"/>
+          </w:tcPr>
+          <w:p>
+            <w:r>
+              <w:rPr>
+                <w:sz w:val="18"/>
+              </w:rPr>
+              <w:t>点面积/透明度、红蓝/色觉友好橙蓝/紫绿、对称X轴、阈值线、指定/自动标签、坐标范围</w:t>
+            </w:r>
+          </w:p>
+        </w:tc>
+        <w:tc>
+          <w:tcPr>
+            <w:tcW w:type="dxa" w:w="3175"/>
+            <w:shd w:fill="F4F7F5"/>
+          </w:tcPr>
+          <w:p>
+            <w:r>
+              <w:rPr>
+                <w:sz w:val="18"/>
+              </w:rPr>
+              <w:t>自动标签优先当前图中显著基因；隐藏极值和改变图中阈值不改变统计结果</w:t>
+            </w:r>
+          </w:p>
+        </w:tc>
+      </w:tr>
+      <w:tr>
+        <w:trPr>
+          <w:cantSplit/>
+        </w:trPr>
+        <w:tc>
+          <w:tcPr>
+            <w:tcW w:type="dxa" w:w="3175"/>
+            <w:shd w:fill="FFFFFF"/>
+          </w:tcPr>
+          <w:p>
+            <w:r>
+              <w:rPr>
+                <w:sz w:val="18"/>
+              </w:rPr>
+              <w:t>PCA/方差解释</w:t>
+            </w:r>
+          </w:p>
+        </w:tc>
+        <w:tc>
+          <w:tcPr>
+            <w:tcW w:type="dxa" w:w="3175"/>
+            <w:shd w:fill="FFFFFF"/>
+          </w:tcPr>
+          <w:p>
+            <w:r>
+              <w:rPr>
+                <w:sz w:val="18"/>
+              </w:rPr>
+              <w:t>PC选择、样本标签、点样式、分组色、描述性椭圆；方差条形与累计线</w:t>
+            </w:r>
+          </w:p>
+        </w:tc>
+        <w:tc>
+          <w:tcPr>
+            <w:tcW w:type="dxa" w:w="3175"/>
+            <w:shd w:fill="FFFFFF"/>
+          </w:tcPr>
+          <w:p>
+            <w:r>
+              <w:rPr>
+                <w:sz w:val="18"/>
+              </w:rPr>
+              <w:t>椭圆不是显著性检验，≥3且不共线才能绘制</w:t>
+            </w:r>
+          </w:p>
+        </w:tc>
+      </w:tr>
+      <w:tr>
+        <w:trPr>
+          <w:cantSplit/>
+        </w:trPr>
+        <w:tc>
+          <w:tcPr>
+            <w:tcW w:type="dxa" w:w="3175"/>
+            <w:shd w:fill="F4F7F5"/>
+          </w:tcPr>
+          <w:p>
+            <w:r>
+              <w:rPr>
+                <w:sz w:val="18"/>
+              </w:rPr>
+              <w:t>P值与离散度</w:t>
+            </w:r>
+          </w:p>
+        </w:tc>
+        <w:tc>
+          <w:tcPr>
+            <w:tcW w:type="dxa" w:w="3175"/>
+            <w:shd w:fill="F4F7F5"/>
+          </w:tcPr>
+          <w:p>
+            <w:r>
+              <w:rPr>
+                <w:sz w:val="18"/>
+              </w:rPr>
+              <w:t>原始P/padj分布、基因估计/拟合趋势/最终离散度</w:t>
+            </w:r>
+          </w:p>
+        </w:tc>
+        <w:tc>
+          <w:tcPr>
+            <w:tcW w:type="dxa" w:w="3175"/>
+            <w:shd w:fill="F4F7F5"/>
+          </w:tcPr>
+          <w:p>
+            <w:r>
+              <w:rPr>
+                <w:sz w:val="18"/>
+              </w:rPr>
+              <w:t>结合独立过滤、Cook和实际设计判断，不机械要求P值均匀</w:t>
+            </w:r>
+          </w:p>
+        </w:tc>
+      </w:tr>
+      <w:tr>
+        <w:trPr>
+          <w:cantSplit/>
+        </w:trPr>
+        <w:tc>
+          <w:tcPr>
+            <w:tcW w:type="dxa" w:w="3175"/>
+            <w:shd w:fill="FFFFFF"/>
+          </w:tcPr>
+          <w:p>
+            <w:r>
+              <w:rPr>
+                <w:sz w:val="18"/>
+              </w:rPr>
+              <w:t>基因/活性热图</w:t>
+            </w:r>
+          </w:p>
+        </w:tc>
+        <w:tc>
+          <w:tcPr>
+            <w:tcW w:type="dxa" w:w="3175"/>
+            <w:shd w:fill="FFFFFF"/>
+          </w:tcPr>
+          <w:p>
+            <w:r>
+              <w:rPr>
+                <w:sz w:val="18"/>
+              </w:rPr>
+              <w:t>独立行列聚类、原始/分组顺序、逐行Z或原分数、连续色谱、色阶、单元格数值、基因Symbol/ID</w:t>
+            </w:r>
+          </w:p>
+        </w:tc>
+        <w:tc>
+          <w:tcPr>
+            <w:tcW w:type="dxa" w:w="3175"/>
+            <w:shd w:fill="FFFFFF"/>
+          </w:tcPr>
+          <w:p>
+            <w:r>
+              <w:rPr>
+                <w:sz w:val="18"/>
+              </w:rPr>
+              <w:t>手动基因不自动代表DEG；原分数和Z-score的意义不同</w:t>
+            </w:r>
+          </w:p>
+        </w:tc>
+      </w:tr>
+      <w:tr>
+        <w:trPr>
+          <w:cantSplit/>
+        </w:trPr>
+        <w:tc>
+          <w:tcPr>
+            <w:tcW w:type="dxa" w:w="3175"/>
+            <w:shd w:fill="F4F7F5"/>
+          </w:tcPr>
+          <w:p>
+            <w:r>
+              <w:rPr>
+                <w:sz w:val="18"/>
+              </w:rPr>
+              <w:t>相关/距离/DEG重叠</w:t>
+            </w:r>
+          </w:p>
+        </w:tc>
+        <w:tc>
+          <w:tcPr>
+            <w:tcW w:type="dxa" w:w="3175"/>
+            <w:shd w:fill="F4F7F5"/>
+          </w:tcPr>
+          <w:p>
+            <w:r>
+              <w:rPr>
+                <w:sz w:val="18"/>
+              </w:rPr>
+              <w:t>Pearson/Spearman、average排序、色阶、数值；跨比较Jaccard</w:t>
+            </w:r>
+          </w:p>
+        </w:tc>
+        <w:tc>
+          <w:tcPr>
+            <w:tcW w:type="dxa" w:w="3175"/>
+            <w:shd w:fill="F4F7F5"/>
+          </w:tcPr>
+          <w:p>
+            <w:r>
+              <w:rPr>
+                <w:sz w:val="18"/>
+              </w:rPr>
+              <w:t>空DEG并集显示0是展示约定；先统一比较方向和所用方案</w:t>
+            </w:r>
+          </w:p>
+        </w:tc>
+      </w:tr>
+      <w:tr>
+        <w:trPr>
+          <w:cantSplit/>
+        </w:trPr>
+        <w:tc>
+          <w:tcPr>
+            <w:tcW w:type="dxa" w:w="3175"/>
+            <w:shd w:fill="FFFFFF"/>
+          </w:tcPr>
+          <w:p>
+            <w:r>
+              <w:rPr>
+                <w:sz w:val="18"/>
+              </w:rPr>
+              <w:t>ORA/GSEA/活性差异</w:t>
+            </w:r>
+          </w:p>
+        </w:tc>
+        <w:tc>
+          <w:tcPr>
+            <w:tcW w:type="dxa" w:w="3175"/>
+            <w:shd w:fill="FFFFFF"/>
+          </w:tcPr>
+          <w:p>
+            <w:r>
+              <w:rPr>
+                <w:sz w:val="18"/>
+              </w:rPr>
+              <w:t>点图/条形/棒棒糖、显示数量、排序、阈值、名称换行；ORA方向、ontology、GeneRatio/RichFactor/命中数/−log10q</w:t>
+            </w:r>
+          </w:p>
+        </w:tc>
+        <w:tc>
+          <w:tcPr>
+            <w:tcW w:type="dxa" w:w="3175"/>
+            <w:shd w:fill="FFFFFF"/>
+          </w:tcPr>
+          <w:p>
+            <w:r>
+              <w:rPr>
+                <w:sz w:val="18"/>
+              </w:rPr>
+              <w:t>不把GeneRatio与RichFactor当作同一个指标，不把NES当LFC</w:t>
+            </w:r>
+          </w:p>
+        </w:tc>
+      </w:tr>
+      <w:tr>
+        <w:trPr>
+          <w:cantSplit/>
+        </w:trPr>
+        <w:tc>
+          <w:tcPr>
+            <w:tcW w:type="dxa" w:w="3175"/>
+            <w:shd w:fill="F4F7F5"/>
+          </w:tcPr>
+          <w:p>
+            <w:r>
+              <w:rPr>
+                <w:sz w:val="18"/>
+              </w:rPr>
+              <w:t>reads质控</w:t>
+            </w:r>
+          </w:p>
+        </w:tc>
+        <w:tc>
+          <w:tcPr>
+            <w:tcW w:type="dxa" w:w="3175"/>
+            <w:shd w:fill="F4F7F5"/>
+          </w:tcPr>
+          <w:p>
+            <w:r>
+              <w:rPr>
+                <w:sz w:val="18"/>
+              </w:rPr>
+              <w:t>质量/碱基曲线选择R1/R2、过滤前/后/两者；Q20/Q30/GC/保留率汇总</w:t>
+            </w:r>
+          </w:p>
+        </w:tc>
+        <w:tc>
+          <w:tcPr>
+            <w:tcW w:type="dxa" w:w="3175"/>
+            <w:shd w:fill="F4F7F5"/>
+          </w:tcPr>
+          <w:p>
+            <w:r>
+              <w:rPr>
+                <w:sz w:val="18"/>
+              </w:rPr>
+              <w:t>缺少某端或元数据时提示，不生成虚假曲线</w:t>
+            </w:r>
+          </w:p>
+        </w:tc>
+      </w:tr>
+      <w:tr>
+        <w:trPr>
+          <w:cantSplit/>
+        </w:trPr>
+        <w:tc>
+          <w:tcPr>
+            <w:tcW w:type="dxa" w:w="3175"/>
+            <w:shd w:fill="FFFFFF"/>
+          </w:tcPr>
+          <w:p>
+            <w:r>
+              <w:rPr>
+                <w:sz w:val="18"/>
+              </w:rPr>
+              <w:t>WGCNA</w:t>
+            </w:r>
+          </w:p>
+        </w:tc>
+        <w:tc>
+          <w:tcPr>
+            <w:tcW w:type="dxa" w:w="3175"/>
+            <w:shd w:fill="FFFFFF"/>
+          </w:tcPr>
+          <w:p>
+            <w:r>
+              <w:rPr>
+                <w:sz w:val="18"/>
+              </w:rPr>
+              <w:t>软阈值双轴拟合/连接度、模块关联数值与q、指定模块hub条形、模块GO/GMT功能富集、子网络节点/边阈值与标签</w:t>
+            </w:r>
+          </w:p>
+        </w:tc>
+        <w:tc>
+          <w:tcPr>
+            <w:tcW w:type="dxa" w:w="3175"/>
+            <w:shd w:fill="FFFFFF"/>
+          </w:tcPr>
+          <w:p>
+            <w:r>
+              <w:rPr>
+                <w:sz w:val="18"/>
+              </w:rPr>
+              <w:t>hub排除grey，子网络最多来自已保存的120基因/500边，不能推断全网络或PPI</w:t>
+            </w:r>
+          </w:p>
+        </w:tc>
+      </w:tr>
+    </w:tbl>
+    <w:p/>
+    <w:p>
+      <w:r>
+        <w:rPr/>
+        <w:t xml:space="preserve">操作时先选图，再改参数，点击“预览调整”；临时预览不写结果文件。满意后“重绘并保存”会同步SVG/PDF/PNG、绘图数据、settings和HTML报告。下载设置可留作图注和复核依据。旧任务新增图在首次下载时会按保存参数生成，已有统计表不重算。结果表点击列名可按该列升降序排列。自动生成中单图遇到参数/数据问题会记录 </w:t>
+      </w:r>
+      <w:r>
+        <w:rPr>
+          <w:rFonts w:ascii="Consolas" w:hAnsi="Consolas"/>
+          <w:sz w:val="18"/>
+          <w:shd w:fill="EDF4EF"/>
+        </w:rPr>
+        <w:t>plot-warnings.json</w:t>
+      </w:r>
+      <w:r>
+        <w:rPr/>
+        <w:t>，统计表保留，任务注意事项会提示；不要忽略该文件。</w:t>
+      </w:r>
+    </w:p>
+    <w:p>
+      <w:pPr>
+        <w:pStyle w:val="Heading2"/>
+      </w:pPr>
+      <w:bookmarkStart w:id="116" w:name="section-a0d1d53b625d"/>
+      <w:r>
+        <w:rPr/>
+        <w:t>27.5 更新与推荐阅读</w:t>
+      </w:r>
+      <w:bookmarkEnd w:id="116"/>
+    </w:p>
+    <w:p>
+      <w:r>
+        <w:rPr/>
+        <w:t xml:space="preserve">GitHub改动不会直接更新你D盘的安装。完成或取消正在运行的任务后，双击 </w:t>
+      </w:r>
+      <w:r>
+        <w:rPr>
+          <w:rFonts w:ascii="Consolas" w:hAnsi="Consolas"/>
+          <w:sz w:val="18"/>
+          <w:shd w:fill="EDF4EF"/>
+        </w:rPr>
+        <w:t>D:\转录组分析工作站\更新工作站.bat</w:t>
+      </w:r>
+      <w:r>
+        <w:rPr/>
+        <w:t>，再启动工作站。在最后一项“使用说明与方法参考”核对版本2026.10.27-r3，可下载同步Word。旧任务可采用新绘图控件；新GO背景、基因–表型调整和full-decoy必须新建相应分析，不能仅通过重新画图获得。</w:t>
+      </w:r>
+    </w:p>
+    <w:p>
+      <w:r>
+        <w:rPr/>
+        <w:t>本轮也补充模块功能解释：在网络页选择“模块功能富集”，指定module、GO/GMT数据库和显示方式；跨模块×术语进行BH。不要把“模块富集”“DEG富集”和“GSEA”混作同一检验，它们的选集与背景不同。</w:t>
+      </w:r>
+    </w:p>
+    <w:p>
+      <w:r>
+        <w:rPr/>
+        <w:t xml:space="preserve">本轮逐项参考DESeq2官方vignette、tximport、nf-core/rnaseq usage、fgseaMultilevel、WGCNA、decoupleR ULM源代码，并借鉴enrichplot、EnhancedVolcano和ComplexHeatmap的图形组织。方法论文与链接见第24章；这些是方法/界面参考，工作站并未自动调用全部参考项目。另可直接查看 </w:t>
+      </w:r>
+      <w:hyperlink r:id="rId60">
+        <w:r>
+          <w:rPr>
+            <w:color w:val="126657"/>
+            <w:u w:val="single"/>
+          </w:rPr>
+          <w:t>DESeq2官方教程源码</w:t>
+        </w:r>
+      </w:hyperlink>
+      <w:r>
+        <w:rPr/>
+        <w:t>、</w:t>
+      </w:r>
+      <w:hyperlink r:id="rId61">
+        <w:r>
+          <w:rPr>
+            <w:color w:val="126657"/>
+            <w:u w:val="single"/>
+          </w:rPr>
+          <w:t>nf-core索引建议</w:t>
+        </w:r>
+      </w:hyperlink>
+      <w:r>
+        <w:rPr/>
+        <w:t>、</w:t>
+      </w:r>
+      <w:hyperlink r:id="rId49">
+        <w:r>
+          <w:rPr>
+            <w:color w:val="126657"/>
+            <w:u w:val="single"/>
+          </w:rPr>
+          <w:t>EnhancedVolcano</w:t>
+        </w:r>
+      </w:hyperlink>
+      <w:r>
+        <w:rPr/>
+        <w:t>、</w:t>
+      </w:r>
+      <w:hyperlink r:id="rId50">
+        <w:r>
+          <w:rPr>
+            <w:color w:val="126657"/>
+            <w:u w:val="single"/>
+          </w:rPr>
+          <w:t>ComplexHeatmap</w:t>
+        </w:r>
+      </w:hyperlink>
+      <w:r>
+        <w:rPr/>
+        <w:t>。</w:t>
       </w:r>
     </w:p>
     <w:sectPr>
@@ -19811,7 +20755,7 @@
       <w:jc w:val="right"/>
     </w:pPr>
     <w:r>
-      <w:t xml:space="preserve">说明书 2026.10.26-r2  ·  </w:t>
+      <w:t xml:space="preserve">说明书 2026.10.27-r3  ·  </w:t>
     </w:r>
     <w:fldSimple w:instr="PAGE"/>
   </w:p>

</xml_diff>

<commit_message>
Reset new inputs and add explicit recovery and standalone analysis modules
</commit_message>
<xml_diff>
--- a/docs/USER_GUIDE.docx
+++ b/docs/USER_GUIDE.docx
@@ -28,7 +28,7 @@
     </w:p>
     <w:p>
       <w:r>
-        <w:t>说明书版本：2026.10.27-r3</w:t>
+        <w:t>说明书版本：2026.10.27-r4</w:t>
         <w:br/>
         <w:t>适用程序：v2.0</w:t>
         <w:br/>
@@ -45,7 +45,7 @@
         <w:pStyle w:val="Caption"/>
       </w:pPr>
       <w:r>
-        <w:t>程序内容指纹：sha256:5bcab7cd45d65b69d1edee1b34923e3fc75edc237ff61a370f89a35d237fcdc8</w:t>
+        <w:t>程序内容指纹：sha256:fdff95d07b264541d5d6d5e995df2bb94e5d8891226f9832d169434c4f4b623c</w:t>
       </w:r>
     </w:p>
     <w:p>
@@ -637,6 +637,21 @@
       </w:hyperlink>
     </w:p>
     <w:p>
+      <w:pPr>
+        <w:spacing w:after="40"/>
+        <w:ind w:left="0"/>
+      </w:pPr>
+      <w:hyperlink w:anchor="section-427b9cc3e1ce">
+        <w:r>
+          <w:rPr>
+            <w:color w:val="126657"/>
+            <w:u w:val="single"/>
+          </w:rPr>
+          <w:t>28. 空白新任务、失败恢复与单步分析</w:t>
+        </w:r>
+      </w:hyperlink>
+    </w:p>
+    <w:p>
       <w:r>
         <w:br w:type="page"/>
       </w:r>
@@ -644,7 +659,7 @@
     <w:p>
       <w:r>
         <w:rPr/>
-        <w:t>说明书版本：2026.10.27-r3</w:t>
+        <w:t>说明书版本：2026.10.27-r4</w:t>
       </w:r>
     </w:p>
     <w:p>
@@ -12578,13 +12593,19 @@
     <w:p>
       <w:r>
         <w:rPr/>
+        <w:t>每次重新打开、刷新页面（包括浏览器前进/后退恢复）或点击“新建分析”，输入表单都会恢复默认：清空样本/计数/参考/注释/GMT/调控网络路径、表型和协变量，重置比较组合、样本选择、分组颜色及参数，并清除旧预览和检查提示。不再从浏览器自动带入上次输入，未提交的填写内容也不会保留。已提交的任务、输入记录和分析结果仍保存在工作站，后台任务继续运行，可从右上角项目列表重新选择查看。</w:t>
+      </w:r>
+    </w:p>
+    <w:p>
+      <w:r>
+        <w:rPr/>
         <w:t>任务失败时先看“报告与导出”的执行日志，找到第一个实际失败的工具及其错误，而不是只看最后一行的通用退出码。确认输入路径、参考和网络后，可对失败或取消任务点击“重试”。已完成且输入文件路径/大小/修改时间标记一致的 fastp、Salmon 索引和定量可复用；统计和图表会按任务配置继续执行。</w:t>
       </w:r>
     </w:p>
     <w:p>
       <w:r>
         <w:rPr/>
-        <w:t>重试用于恢复原任务，不是随意更改模型后沿用旧结果。需要改变样本设计、过滤、参考、收缩、基因集或 WGCNA 参数时，建议创建新分析，以保留可比较的参数与结果。切换已有两套 DEG 方案不需要重新拟合模型。</w:t>
+        <w:t>“原参数重试”恢复原任务。需要改变样本设计、过滤、参考、收缩、基因集或WGCNA参数时，可选择“调整参数后续跑”另存并复用合格上游缓存，或从相应单步入口直接开始；操作见第28章。切换已有两套 DEG 方案不需要重新拟合模型。</w:t>
       </w:r>
     </w:p>
     <w:p>
@@ -20733,6 +20754,796 @@
       <w:r>
         <w:rPr/>
         <w:t>。</w:t>
+      </w:r>
+    </w:p>
+    <w:p>
+      <w:pPr>
+        <w:pStyle w:val="Heading1"/>
+      </w:pPr>
+      <w:bookmarkStart w:id="117" w:name="section-427b9cc3e1ce"/>
+      <w:r>
+        <w:rPr/>
+        <w:t>28. 空白新任务、失败恢复与单步分析</w:t>
+      </w:r>
+      <w:bookmarkEnd w:id="117"/>
+    </w:p>
+    <w:p>
+      <w:r>
+        <w:rPr/>
+        <w:t>本章为2026.10.27-r4新增。新任务输入与已有任务结果分别管理：打开、刷新、前进/后退恢复页面或点击“新建分析”，都会清空未提交填写和旧样本预览；后台已提交的任务继续运行，历史结果保存在项目目录。需要查看进度或恢复时，从右上角重新选择项目。只有主动点击恢复/载入按钮，才将选定项目的参数或结果填入新表单。</w:t>
+      </w:r>
+    </w:p>
+    <w:p>
+      <w:pPr>
+        <w:pStyle w:val="Heading2"/>
+      </w:pPr>
+      <w:bookmarkStart w:id="118" w:name="section-517e1ffb123e"/>
+      <w:r>
+        <w:rPr/>
+        <w:t>28.1 根据已有材料选择起点</w:t>
+      </w:r>
+      <w:bookmarkEnd w:id="118"/>
+    </w:p>
+    <w:p>
+      <w:r>
+        <w:rPr/>
+        <w:t>在“样本与实验设计”的“选择分析入口”选择环节。完整分析自动连接已有的 fastp、Salmon、tximport、DESeq2 和下游模块。单步入口使用其实际需要的输入，不需要先上传FASTQ。</w:t>
+      </w:r>
+    </w:p>
+    <w:tbl>
+      <w:tblPr>
+        <w:tblStyle w:val="TableGrid"/>
+        <w:tblW w:type="auto" w:w="0"/>
+        <w:tblLook w:firstColumn="1" w:firstRow="1" w:lastColumn="0" w:lastRow="0" w:noHBand="0" w:noVBand="1" w:val="04A0"/>
+      </w:tblPr>
+      <w:tblGrid>
+        <w:gridCol w:w="3175"/>
+        <w:gridCol w:w="3175"/>
+        <w:gridCol w:w="3175"/>
+      </w:tblGrid>
+      <w:tr>
+        <w:trPr>
+          <w:tblHeader/>
+          <w:cantSplit/>
+        </w:trPr>
+        <w:tc>
+          <w:tcPr>
+            <w:tcW w:type="dxa" w:w="3175"/>
+            <w:shd w:fill="DCECE5"/>
+          </w:tcPr>
+          <w:p>
+            <w:r>
+              <w:rPr>
+                <w:b/>
+                <w:sz w:val="18"/>
+              </w:rPr>
+              <w:t>入口</w:t>
+            </w:r>
+          </w:p>
+        </w:tc>
+        <w:tc>
+          <w:tcPr>
+            <w:tcW w:type="dxa" w:w="3175"/>
+            <w:shd w:fill="DCECE5"/>
+          </w:tcPr>
+          <w:p>
+            <w:r>
+              <w:rPr>
+                <w:b/>
+                <w:sz w:val="18"/>
+              </w:rPr>
+              <w:t>需要输入</w:t>
+            </w:r>
+          </w:p>
+        </w:tc>
+        <w:tc>
+          <w:tcPr>
+            <w:tcW w:type="dxa" w:w="3175"/>
+            <w:shd w:fill="DCECE5"/>
+          </w:tcPr>
+          <w:p>
+            <w:r>
+              <w:rPr>
+                <w:b/>
+                <w:sz w:val="18"/>
+              </w:rPr>
+              <w:t>实际执行与限制</w:t>
+            </w:r>
+          </w:p>
+        </w:tc>
+      </w:tr>
+      <w:tr>
+        <w:trPr>
+          <w:cantSplit/>
+        </w:trPr>
+        <w:tc>
+          <w:tcPr>
+            <w:tcW w:type="dxa" w:w="3175"/>
+            <w:shd w:fill="FFFFFF"/>
+          </w:tcPr>
+          <w:p>
+            <w:r>
+              <w:rPr>
+                <w:sz w:val="18"/>
+              </w:rPr>
+              <w:t>完整分析</w:t>
+            </w:r>
+          </w:p>
+        </w:tc>
+        <w:tc>
+          <w:tcPr>
+            <w:tcW w:type="dxa" w:w="3175"/>
+            <w:shd w:fill="FFFFFF"/>
+          </w:tcPr>
+          <w:p>
+            <w:r>
+              <w:rPr>
+                <w:sz w:val="18"/>
+              </w:rPr>
+              <w:t>样本表，以及FASTQ+参考 / Salmon+tx2gene / 原始计数三选一</w:t>
+            </w:r>
+          </w:p>
+        </w:tc>
+        <w:tc>
+          <w:tcPr>
+            <w:tcW w:type="dxa" w:w="3175"/>
+            <w:shd w:fill="FFFFFF"/>
+          </w:tcPr>
+          <w:p>
+            <w:r>
+              <w:rPr>
+                <w:sz w:val="18"/>
+              </w:rPr>
+              <w:t>自动执行从所选起点开始的完整流程，结果自动传入后续计算</w:t>
+            </w:r>
+          </w:p>
+        </w:tc>
+      </w:tr>
+      <w:tr>
+        <w:trPr>
+          <w:cantSplit/>
+        </w:trPr>
+        <w:tc>
+          <w:tcPr>
+            <w:tcW w:type="dxa" w:w="3175"/>
+            <w:shd w:fill="F4F7F5"/>
+          </w:tcPr>
+          <w:p>
+            <w:r>
+              <w:rPr>
+                <w:sz w:val="18"/>
+              </w:rPr>
+              <w:t>单独差异分析</w:t>
+            </w:r>
+          </w:p>
+        </w:tc>
+        <w:tc>
+          <w:tcPr>
+            <w:tcW w:type="dxa" w:w="3175"/>
+            <w:shd w:fill="F4F7F5"/>
+          </w:tcPr>
+          <w:p>
+            <w:r>
+              <w:rPr>
+                <w:sz w:val="18"/>
+              </w:rPr>
+              <w:t>样本表 + 原始整数计数，或样本表quant列 + quant.sf + tx2gene</w:t>
+            </w:r>
+          </w:p>
+        </w:tc>
+        <w:tc>
+          <w:tcPr>
+            <w:tcW w:type="dxa" w:w="3175"/>
+            <w:shd w:fill="F4F7F5"/>
+          </w:tcPr>
+          <w:p>
+            <w:r>
+              <w:rPr>
+                <w:sz w:val="18"/>
+              </w:rPr>
+              <w:t>仅运行DESeq2和表达诊断；Salmon模式保留tximport长度信息。下游富集/活性/网络可再独立启动，无需重新处理FASTQ</w:t>
+            </w:r>
+          </w:p>
+        </w:tc>
+      </w:tr>
+      <w:tr>
+        <w:trPr>
+          <w:cantSplit/>
+        </w:trPr>
+        <w:tc>
+          <w:tcPr>
+            <w:tcW w:type="dxa" w:w="3175"/>
+            <w:shd w:fill="FFFFFF"/>
+          </w:tcPr>
+          <w:p>
+            <w:r>
+              <w:rPr>
+                <w:sz w:val="18"/>
+              </w:rPr>
+              <w:t>单独GO/KEGG/GSEA</w:t>
+            </w:r>
+          </w:p>
+        </w:tc>
+        <w:tc>
+          <w:tcPr>
+            <w:tcW w:type="dxa" w:w="3175"/>
+            <w:shd w:fill="FFFFFF"/>
+          </w:tcPr>
+          <w:p>
+            <w:r>
+              <w:rPr>
+                <w:sz w:val="18"/>
+              </w:rPr>
+              <w:t>完整差异表，真实注释/GMT；可额外提供表达矩阵和样本表</w:t>
+            </w:r>
+          </w:p>
+        </w:tc>
+        <w:tc>
+          <w:tcPr>
+            <w:tcW w:type="dxa" w:w="3175"/>
+            <w:shd w:fill="FFFFFF"/>
+          </w:tcPr>
+          <w:p>
+            <w:r>
+              <w:rPr>
+                <w:sz w:val="18"/>
+              </w:rPr>
+              <w:t>从输入统计重新筛两套DEG并计算ORA；有完整stat时运行GSEA。没有表达矩阵时只查看统计/富集，不伪造样本表达</w:t>
+            </w:r>
+          </w:p>
+        </w:tc>
+      </w:tr>
+      <w:tr>
+        <w:trPr>
+          <w:cantSplit/>
+        </w:trPr>
+        <w:tc>
+          <w:tcPr>
+            <w:tcW w:type="dxa" w:w="3175"/>
+            <w:shd w:fill="F4F7F5"/>
+          </w:tcPr>
+          <w:p>
+            <w:r>
+              <w:rPr>
+                <w:sz w:val="18"/>
+              </w:rPr>
+              <w:t>单独表达诊断与绘图</w:t>
+            </w:r>
+          </w:p>
+        </w:tc>
+        <w:tc>
+          <w:tcPr>
+            <w:tcW w:type="dxa" w:w="3175"/>
+            <w:shd w:fill="F4F7F5"/>
+          </w:tcPr>
+          <w:p>
+            <w:r>
+              <w:rPr>
+                <w:sz w:val="18"/>
+              </w:rPr>
+              <w:t>已转换表达矩阵 + sample/group样本表</w:t>
+            </w:r>
+          </w:p>
+        </w:tc>
+        <w:tc>
+          <w:tcPr>
+            <w:tcW w:type="dxa" w:w="3175"/>
+            <w:shd w:fill="F4F7F5"/>
+          </w:tcPr>
+          <w:p>
+            <w:r>
+              <w:rPr>
+                <w:sz w:val="18"/>
+              </w:rPr>
+              <w:t>PCA、分布、相关、距离和基因表达；不拟合DESeq2，不推算reads质控</w:t>
+            </w:r>
+          </w:p>
+        </w:tc>
+      </w:tr>
+      <w:tr>
+        <w:trPr>
+          <w:cantSplit/>
+        </w:trPr>
+        <w:tc>
+          <w:tcPr>
+            <w:tcW w:type="dxa" w:w="3175"/>
+            <w:shd w:fill="FFFFFF"/>
+          </w:tcPr>
+          <w:p>
+            <w:r>
+              <w:rPr>
+                <w:sz w:val="18"/>
+              </w:rPr>
+              <w:t>单独通路/调控活性</w:t>
+            </w:r>
+          </w:p>
+        </w:tc>
+        <w:tc>
+          <w:tcPr>
+            <w:tcW w:type="dxa" w:w="3175"/>
+            <w:shd w:fill="FFFFFF"/>
+          </w:tcPr>
+          <w:p>
+            <w:r>
+              <w:rPr>
+                <w:sz w:val="18"/>
+              </w:rPr>
+              <w:t>已转换表达矩阵 + 样本表 + 匹配的GMT或小鼠调控网络</w:t>
+            </w:r>
+          </w:p>
+        </w:tc>
+        <w:tc>
+          <w:tcPr>
+            <w:tcW w:type="dxa" w:w="3175"/>
+            <w:shd w:fill="FFFFFF"/>
+          </w:tcPr>
+          <w:p>
+            <w:r>
+              <w:rPr>
+                <w:sz w:val="18"/>
+              </w:rPr>
+              <w:t>ssGSEA/ULM；存在有效组间比较时使用相同协变量的limma。单组可计算样本分数，不生成虚假的组间差异</w:t>
+            </w:r>
+          </w:p>
+        </w:tc>
+      </w:tr>
+      <w:tr>
+        <w:trPr>
+          <w:cantSplit/>
+        </w:trPr>
+        <w:tc>
+          <w:tcPr>
+            <w:tcW w:type="dxa" w:w="3175"/>
+            <w:shd w:fill="F4F7F5"/>
+          </w:tcPr>
+          <w:p>
+            <w:r>
+              <w:rPr>
+                <w:sz w:val="18"/>
+              </w:rPr>
+              <w:t>单独WGCNA</w:t>
+            </w:r>
+          </w:p>
+        </w:tc>
+        <w:tc>
+          <w:tcPr>
+            <w:tcW w:type="dxa" w:w="3175"/>
+            <w:shd w:fill="F4F7F5"/>
+          </w:tcPr>
+          <w:p>
+            <w:r>
+              <w:rPr>
+                <w:sz w:val="18"/>
+              </w:rPr>
+              <w:t>已转换表达矩阵 + 样本表；可加表型/注释/GMT</w:t>
+            </w:r>
+          </w:p>
+        </w:tc>
+        <w:tc>
+          <w:tcPr>
+            <w:tcW w:type="dxa" w:w="3175"/>
+            <w:shd w:fill="F4F7F5"/>
+          </w:tcPr>
+          <w:p>
+            <w:r>
+              <w:rPr>
+                <w:sz w:val="18"/>
+              </w:rPr>
+              <w:t>网络至少15独立样本，推荐20+；模块、hub、模块功能富集与关联。小样本明确跳过网络</w:t>
+            </w:r>
+          </w:p>
+        </w:tc>
+      </w:tr>
+    </w:tbl>
+    <w:p/>
+    <w:p>
+      <w:r>
+        <w:rPr/>
+        <w:t xml:space="preserve">矩阵单步入口至少需要4个样本、10个有变异的基因，列名匹配sample。可声明VST、log2(normalized count+1)或log2(TPM+1)，程序按声明单位使用已转换值，不再重复做log或VST。原始TPM和原始计数不应冒充VST。常用起点是工作站保存的 </w:t>
+      </w:r>
+      <w:r>
+        <w:rPr>
+          <w:rFonts w:ascii="Consolas" w:hAnsi="Consolas"/>
+          <w:sz w:val="18"/>
+          <w:shd w:fill="EDF4EF"/>
+        </w:rPr>
+        <w:t>vst.csv</w:t>
+      </w:r>
+      <w:r>
+        <w:rPr/>
+        <w:t>；其他单位会在坐标和方法中明确说明。为兼容绘图接口，任务目录内的通用转换矩阵仍命名为vst.csv，解释数值时必须以本次参数中的expression_unit为准。</w:t>
+      </w:r>
+    </w:p>
+    <w:p>
+      <w:pPr>
+        <w:pStyle w:val="Heading2"/>
+      </w:pPr>
+      <w:bookmarkStart w:id="119" w:name="section-f6a44e63b1b8"/>
+      <w:r>
+        <w:rPr/>
+        <w:t>28.2 完整差异结果的格式与背景</w:t>
+      </w:r>
+      <w:bookmarkEnd w:id="119"/>
+    </w:p>
+    <w:p>
+      <w:r>
+        <w:rPr/>
+        <w:t xml:space="preserve">富集入口识别 </w:t>
+      </w:r>
+      <w:r>
+        <w:rPr>
+          <w:rFonts w:ascii="Consolas" w:hAnsi="Consolas"/>
+          <w:sz w:val="18"/>
+          <w:shd w:fill="EDF4EF"/>
+        </w:rPr>
+        <w:t>gene,log2FoldChange,pvalue</w:t>
+      </w:r>
+      <w:r>
+        <w:rPr/>
+        <w:t xml:space="preserve"> 三个必要字段；建议同时提供 </w:t>
+      </w:r>
+      <w:r>
+        <w:rPr>
+          <w:rFonts w:ascii="Consolas" w:hAnsi="Consolas"/>
+          <w:sz w:val="18"/>
+          <w:shd w:fill="EDF4EF"/>
+        </w:rPr>
+        <w:t>padj,stat,baseMean,symbol</w:t>
+      </w:r>
+      <w:r>
+        <w:rPr/>
+        <w:t>。一个输入文件对应一个比较，界面须声明与该表一致的处理/对照方向。数值可以有合理的NA；P/padj须在0–1之间；gene不可重复。</w:t>
+      </w:r>
+    </w:p>
+    <w:p>
+      <w:r>
+        <w:rPr/>
+        <w:t>必须包含本次测试的未显著基因。只导入公司给出的DEG名单会丢失背景、破坏ORA与GSEA问题定义；应索取完整差异结果。缺少padj时，程序对所有提供的有效pvalue统一做BH并记录来源，因此更不能只上传截断名单；已有padj会原样使用，不重复校正。两种方案仍为pvalue&lt;0.05且|LFC|&gt;0，以及padj&lt;0.05且|LFC|&gt;1。</w:t>
+      </w:r>
+    </w:p>
+    <w:p>
+      <w:r>
+        <w:rPr/>
+        <w:t>GSEA需要完整的、带方向的stat排序。缺少足够stat时明确跳过GSEA，继续ORA；不把DEG列表或−log10(P)伪装成Wald排序。外部导入的stat在曲线标为Imported stat，其统计意义由原分析方法决定。没有baseMean时，无法绘制真实MA图；重复注释ID的代表行按稳定基因顺序选择，不按最显著P挑选。</w:t>
+      </w:r>
+    </w:p>
+    <w:p>
+      <w:r>
+        <w:rPr/>
+        <w:t>ORA在有stat时使用有限stat的可映射测试基因；缺stat时使用有限pvalue的可映射测试基因。GO背景仍按BP/CC/MF分别限定，GMT按本数据库覆盖限定。完整背景和注释版本仍然决定结果是否有意义。</w:t>
+      </w:r>
+    </w:p>
+    <w:p>
+      <w:r>
+        <w:rPr/>
+        <w:t>如同时提供对应样本表和转换表达矩阵，可画差异热图、leading-edge热图及样本表达；不提供时，火山图的点仍能显示导入统计，表达区会明确提示缺少矩阵。无需为了解锁页面而提供虚构表达。</w:t>
+      </w:r>
+    </w:p>
+    <w:p>
+      <w:pPr>
+        <w:pStyle w:val="Heading2"/>
+      </w:pPr>
+      <w:bookmarkStart w:id="120" w:name="section-1d04deafdaa1"/>
+      <w:r>
+        <w:rPr/>
+        <w:t>28.3 自动把上游结果交给下一步</w:t>
+      </w:r>
+      <w:bookmarkEnd w:id="120"/>
+    </w:p>
+    <w:p>
+      <w:pPr>
+        <w:pStyle w:val="ListParagraph"/>
+        <w:ind w:left="283" w:hanging="198"/>
+      </w:pPr>
+      <w:r>
+        <w:t xml:space="preserve">1. </w:t>
+      </w:r>
+      <w:r>
+        <w:rPr/>
+        <w:t>从右上角选择已有项目；有多个比较时先确认当前比较。</w:t>
+      </w:r>
+    </w:p>
+    <w:p>
+      <w:pPr>
+        <w:pStyle w:val="ListParagraph"/>
+        <w:ind w:left="283" w:hanging="198"/>
+      </w:pPr>
+      <w:r>
+        <w:t xml:space="preserve">2. </w:t>
+      </w:r>
+      <w:r>
+        <w:rPr/>
+        <w:t>在“从当前结果继续分析”选择后续环节，点击“载入上游结果”。</w:t>
+      </w:r>
+    </w:p>
+    <w:p>
+      <w:pPr>
+        <w:pStyle w:val="ListParagraph"/>
+        <w:ind w:left="283" w:hanging="198"/>
+      </w:pPr>
+      <w:r>
+        <w:t xml:space="preserve">3. </w:t>
+      </w:r>
+      <w:r>
+        <w:rPr/>
+        <w:t>工作站准备该环节的真实输入路径与匹配样本、注释和基因集；在新表单核对，再修改所需参数。</w:t>
+      </w:r>
+    </w:p>
+    <w:p>
+      <w:pPr>
+        <w:pStyle w:val="ListParagraph"/>
+        <w:ind w:left="283" w:hanging="198"/>
+      </w:pPr>
+      <w:r>
+        <w:t xml:space="preserve">4. </w:t>
+      </w:r>
+      <w:r>
+        <w:rPr/>
+        <w:t>点击“检查样本与参数”，然后“启动分析”。新任务保留upstream_from来源，原项目继续保留。</w:t>
+      </w:r>
+    </w:p>
+    <w:p>
+      <w:r>
+        <w:rPr/>
+        <w:t>例如完整项目完成后，只想更换GMT做GSEA：选择项目和比较 → 选择GO/KEGG/GSEA → 载入上游结果 → 更换GMT → 启动。无需再跑FASTQ、Salmon或DESeq2。</w:t>
+      </w:r>
+    </w:p>
+    <w:p>
+      <w:r>
+        <w:rPr/>
+        <w:t>如果需要更换DESeq2协变量：选择“单独差异分析”。原项目来自Salmon时，自动准备保留各样本quant.sf的样本表和tx2gene，而不是把四舍五入的基因计数当作普通counts丢弃长度信息。原项目来自原始计数时使用其计数快照。VST/TPM任务不能反推DESeq2原始计数，需回到有实际计数/定量的项目或手动导入。</w:t>
+      </w:r>
+    </w:p>
+    <w:p>
+      <w:r>
+        <w:rPr/>
+        <w:t>工作站只在有相应真实文件时提供可用输入。失败任务中已经保存的完整上游结果也可作为来源；如果缺少文件，页面会指出所缺材料。刷新页面会清空这次尚未提交的载入，之后可再次主动选择同一来源。</w:t>
+      </w:r>
+    </w:p>
+    <w:p>
+      <w:pPr>
+        <w:pStyle w:val="Heading2"/>
+      </w:pPr>
+      <w:bookmarkStart w:id="121" w:name="section-18fc1f8f23af"/>
+      <w:r>
+        <w:rPr/>
+        <w:t>28.4 失败后选择合适的恢复方式</w:t>
+      </w:r>
+      <w:bookmarkEnd w:id="121"/>
+    </w:p>
+    <w:tbl>
+      <w:tblPr>
+        <w:tblStyle w:val="TableGrid"/>
+        <w:tblW w:type="auto" w:w="0"/>
+        <w:tblLook w:firstColumn="1" w:firstRow="1" w:lastColumn="0" w:lastRow="0" w:noHBand="0" w:noVBand="1" w:val="04A0"/>
+      </w:tblPr>
+      <w:tblGrid>
+        <w:gridCol w:w="3175"/>
+        <w:gridCol w:w="3175"/>
+        <w:gridCol w:w="3175"/>
+      </w:tblGrid>
+      <w:tr>
+        <w:trPr>
+          <w:tblHeader/>
+          <w:cantSplit/>
+        </w:trPr>
+        <w:tc>
+          <w:tcPr>
+            <w:tcW w:type="dxa" w:w="3175"/>
+            <w:shd w:fill="DCECE5"/>
+          </w:tcPr>
+          <w:p>
+            <w:r>
+              <w:rPr>
+                <w:b/>
+                <w:sz w:val="18"/>
+              </w:rPr>
+              <w:t>情况</w:t>
+            </w:r>
+          </w:p>
+        </w:tc>
+        <w:tc>
+          <w:tcPr>
+            <w:tcW w:type="dxa" w:w="3175"/>
+            <w:shd w:fill="DCECE5"/>
+          </w:tcPr>
+          <w:p>
+            <w:r>
+              <w:rPr>
+                <w:b/>
+                <w:sz w:val="18"/>
+              </w:rPr>
+              <w:t>推荐操作</w:t>
+            </w:r>
+          </w:p>
+        </w:tc>
+        <w:tc>
+          <w:tcPr>
+            <w:tcW w:type="dxa" w:w="3175"/>
+            <w:shd w:fill="DCECE5"/>
+          </w:tcPr>
+          <w:p>
+            <w:r>
+              <w:rPr>
+                <w:b/>
+                <w:sz w:val="18"/>
+              </w:rPr>
+              <w:t>继续的范围</w:t>
+            </w:r>
+          </w:p>
+        </w:tc>
+      </w:tr>
+      <w:tr>
+        <w:trPr>
+          <w:cantSplit/>
+        </w:trPr>
+        <w:tc>
+          <w:tcPr>
+            <w:tcW w:type="dxa" w:w="3175"/>
+            <w:shd w:fill="FFFFFF"/>
+          </w:tcPr>
+          <w:p>
+            <w:r>
+              <w:rPr>
+                <w:sz w:val="18"/>
+              </w:rPr>
+              <w:t>临时断网、Docker未启动或软件运行失败，参数保持原样</w:t>
+            </w:r>
+          </w:p>
+        </w:tc>
+        <w:tc>
+          <w:tcPr>
+            <w:tcW w:type="dxa" w:w="3175"/>
+            <w:shd w:fill="FFFFFF"/>
+          </w:tcPr>
+          <w:p>
+            <w:r>
+              <w:rPr>
+                <w:sz w:val="18"/>
+              </w:rPr>
+              <w:t>选择失败/取消项目 → 原参数重试</w:t>
+            </w:r>
+          </w:p>
+        </w:tc>
+        <w:tc>
+          <w:tcPr>
+            <w:tcW w:type="dxa" w:w="3175"/>
+            <w:shd w:fill="FFFFFF"/>
+          </w:tcPr>
+          <w:p>
+            <w:r>
+              <w:rPr>
+                <w:sz w:val="18"/>
+              </w:rPr>
+              <w:t>使用该任务原配置，核对完成标记和文件后继续；受参考/输入变化影响的步骤会重算</w:t>
+            </w:r>
+          </w:p>
+        </w:tc>
+      </w:tr>
+      <w:tr>
+        <w:trPr>
+          <w:cantSplit/>
+        </w:trPr>
+        <w:tc>
+          <w:tcPr>
+            <w:tcW w:type="dxa" w:w="3175"/>
+            <w:shd w:fill="F4F7F5"/>
+          </w:tcPr>
+          <w:p>
+            <w:r>
+              <w:rPr>
+                <w:sz w:val="18"/>
+              </w:rPr>
+              <w:t>质控/定量已完成，只修改下游模型或数据库</w:t>
+            </w:r>
+          </w:p>
+        </w:tc>
+        <w:tc>
+          <w:tcPr>
+            <w:tcW w:type="dxa" w:w="3175"/>
+            <w:shd w:fill="F4F7F5"/>
+          </w:tcPr>
+          <w:p>
+            <w:r>
+              <w:rPr>
+                <w:sz w:val="18"/>
+              </w:rPr>
+              <w:t>选择来源项目 → 载入相应单步入口</w:t>
+            </w:r>
+          </w:p>
+        </w:tc>
+        <w:tc>
+          <w:tcPr>
+            <w:tcW w:type="dxa" w:w="3175"/>
+            <w:shd w:fill="F4F7F5"/>
+          </w:tcPr>
+          <w:p>
+            <w:r>
+              <w:rPr>
+                <w:sz w:val="18"/>
+              </w:rPr>
+              <w:t>直接使用所需上游结果，节省复制大型reads缓存的空间</w:t>
+            </w:r>
+          </w:p>
+        </w:tc>
+      </w:tr>
+      <w:tr>
+        <w:trPr>
+          <w:cantSplit/>
+        </w:trPr>
+        <w:tc>
+          <w:tcPr>
+            <w:tcW w:type="dxa" w:w="3175"/>
+            <w:shd w:fill="FFFFFF"/>
+          </w:tcPr>
+          <w:p>
+            <w:r>
+              <w:rPr>
+                <w:sz w:val="18"/>
+              </w:rPr>
+              <w:t>中途失败，需要修改处理参数后继续完整流程</w:t>
+            </w:r>
+          </w:p>
+        </w:tc>
+        <w:tc>
+          <w:tcPr>
+            <w:tcW w:type="dxa" w:w="3175"/>
+            <w:shd w:fill="FFFFFF"/>
+          </w:tcPr>
+          <w:p>
+            <w:r>
+              <w:rPr>
+                <w:sz w:val="18"/>
+              </w:rPr>
+              <w:t>选择失败/取消项目 → 调整参数后续跑 → 修改 → 启动</w:t>
+            </w:r>
+          </w:p>
+        </w:tc>
+        <w:tc>
+          <w:tcPr>
+            <w:tcW w:type="dxa" w:w="3175"/>
+            <w:shd w:fill="FFFFFF"/>
+          </w:tcPr>
+          <w:p>
+            <w:r>
+              <w:rPr>
+                <w:sz w:val="18"/>
+              </w:rPr>
+              <w:t>另存新任务；复制输入与处理参数一致的已完成缓存，重新执行受影响步骤及统计</w:t>
+            </w:r>
+          </w:p>
+        </w:tc>
+      </w:tr>
+    </w:tbl>
+    <w:p/>
+    <w:p>
+      <w:r>
+        <w:rPr/>
+        <w:t>“调整参数后续跑”会显式恢复原任务参数、比较组合、样本排除和配色。它是主动恢复入口，日常打开或新建仍为空表单。默认勾选“复用输入与参数一致的已完成步骤”，也可关闭，以完全重新运行。</w:t>
+      </w:r>
+    </w:p>
+    <w:p>
+      <w:r>
+        <w:rPr/>
+        <w:t>复用规则示例：只改低表达过滤、协变量、LFC收缩或GMT时，可复用已完成fastp和Salmon；改fastp质量/长度阈值时，相关质控和定量重算；改参考、文库方向或单端片段分布时，相应索引/定量重算。只有完整成功标记且必要文件仍在的样本会被复用，未完成样本继续计算。统计、富集、挖掘和报告按新参数重算，不复用旧设计的DESeq2拟合。</w:t>
+      </w:r>
+    </w:p>
+    <w:p>
+      <w:r>
+        <w:rPr/>
+        <w:t>缓存以独立副本复制到新任务，后续计算不写回原任务。复制会额外占用磁盘，空间不足时可选择单步入口或关闭复用；原项目保留用于比较。</w:t>
+      </w:r>
+      <w:r>
+        <w:rPr>
+          <w:rFonts w:ascii="Consolas" w:hAnsi="Consolas"/>
+          <w:sz w:val="18"/>
+          <w:shd w:fill="EDF4EF"/>
+        </w:rPr>
+        <w:t>resume-provenance.json</w:t>
+      </w:r>
+      <w:r>
+        <w:rPr/>
+        <w:t>记录来源、改变的参数、复用样本/索引与复制字节数。检查主要依据输入路径、大小、修改时间和参数，不是所有大文件的内容哈希；重大工具版本变更、怀疑缓存损坏时应关闭复用，并保留真实输入和版本记录。</w:t>
       </w:r>
     </w:p>
     <w:sectPr>
@@ -20755,7 +21566,7 @@
       <w:jc w:val="right"/>
     </w:pPr>
     <w:r>
-      <w:t xml:space="preserve">说明书 2026.10.27-r3  ·  </w:t>
+      <w:t xml:space="preserve">说明书 2026.10.27-r4  ·  </w:t>
     </w:r>
     <w:fldSimple w:instr="PAGE"/>
   </w:p>

</xml_diff>